<commit_message>
docs(srs): diagrama de contexto con óvalo, entidades, archivos lógicos y flujos EI/EO/EQ
</commit_message>
<xml_diff>
--- a/documentos/SRS_v1.1_con_diagrama_contexto.docx
+++ b/documentos/SRS_v1.1_con_diagrama_contexto.docx
@@ -834,7 +834,7 @@
         <w:spacing w:after="160" w:line="276"/>
       </w:pPr>
       <w:r>
-        <w:t>La Figura 1 muestra el diagrama de contexto de la plataforma (modelo C4, nivel 1): el sistema se representa como una sola caja y se muestran las personas que lo usan y los sistemas externos con los que se comunica.</w:t>
+        <w:t>La Figura 1 muestra el diagrama de contexto del sistema. La plataforma se representa como un óvalo; los rectángulos son las entidades externas (usuario final, operador y vehículo IoT); y los archivos lógicos se dibujan con dos líneas horizontales, uno por cada archivo lógico interno (ILF) y externo (EIF). Cada flecha está rotulada según su tipo: entradas (EI), salidas (EO) y consultas (EQ), con los mismos nombres usados en la estimación por Puntos de Función del Plan de Desarrollo.</w:t>
       </w:r>
     </w:p>
     <w:p>
@@ -845,7 +845,7 @@
       <w:r>
         <w:drawing>
           <wp:inline xmlns:a="http://schemas.openxmlformats.org/drawingml/2006/main" xmlns:pic="http://schemas.openxmlformats.org/drawingml/2006/picture">
-            <wp:extent cx="5760720" cy="5458073"/>
+            <wp:extent cx="6172200" cy="2940612"/>
             <wp:docPr id="1" name="Picture 1"/>
             <wp:cNvGraphicFramePr>
               <a:graphicFrameLocks noChangeAspect="1"/>
@@ -854,7 +854,7 @@
               <a:graphicData uri="http://schemas.openxmlformats.org/drawingml/2006/picture">
                 <pic:pic>
                   <pic:nvPicPr>
-                    <pic:cNvPr id="0" name="01-c4-contexto.png"/>
+                    <pic:cNvPr id="0" name="00-diagrama-contexto-srs.png"/>
                     <pic:cNvPicPr/>
                   </pic:nvPicPr>
                   <pic:blipFill>
@@ -866,7 +866,7 @@
                   <pic:spPr>
                     <a:xfrm>
                       <a:off x="0" y="0"/>
-                      <a:ext cx="5760720" cy="5458073"/>
+                      <a:ext cx="6172200" cy="2940612"/>
                     </a:xfrm>
                     <a:prstGeom prst="rect"/>
                   </pic:spPr>
@@ -887,7 +887,7 @@
           <w:i/>
           <w:sz w:val="18"/>
         </w:rPr>
-        <w:t>Figura 1. Diagrama de contexto de la Plataforma Multimodal de Micromovilidad</w:t>
+        <w:t>Figura 1. Diagrama de contexto (entradas, salidas, consultas, archivos lógicos e interfaces)</w:t>
       </w:r>
     </w:p>
     <w:p>

</xml_diff>